<commit_message>
Planner Agent Improvement (not final)
</commit_message>
<xml_diff>
--- a/docs/classifier-functional-test-workbook.docx
+++ b/docs/classifier-functional-test-workbook.docx
@@ -628,7 +628,6 @@
             <w:pPr>
               <w:spacing w:after="20"/>
               <w:rPr>
-                <w:rFonts w:hint="cs"/>
                 <w:rtl/>
                 <w:lang w:bidi="he-IL"/>
               </w:rPr>
@@ -1400,15 +1399,16 @@
             <w:r>
               <w:rPr>
                 <w:sz w:val="16"/>
-              </w:rPr>
-              <w:t xml:space="preserve">Pass </w:t>
-            </w:r>
-            <w:r>
-              <w:rPr>
-                <w:sz w:val="16"/>
                 <w:highlight w:val="green"/>
               </w:rPr>
-              <w:t>[ ]</w:t>
+              <w:t xml:space="preserve">Pass [ </w:t>
+            </w:r>
+            <w:r>
+              <w:rPr>
+                <w:sz w:val="16"/>
+                <w:highlight w:val="green"/>
+              </w:rPr>
+              <w:t>]</w:t>
             </w:r>
             <w:r>
               <w:rPr>
@@ -1441,8 +1441,6 @@
               </w:rPr>
               <w:t xml:space="preserve">Tokens: </w:t>
             </w:r>
-            <w:bookmarkStart w:id="0" w:name="_GoBack"/>
-            <w:bookmarkEnd w:id="0"/>
             <w:r>
               <w:rPr>
                 <w:sz w:val="16"/>
@@ -1566,24 +1564,340 @@
           <w:p>
             <w:pPr>
               <w:spacing w:after="20"/>
-            </w:pPr>
-            <w:r>
-              <w:rPr>
-                <w:sz w:val="16"/>
-              </w:rPr>
-              <w:br/>
-            </w:r>
-            <w:r>
-              <w:rPr>
-                <w:sz w:val="16"/>
-              </w:rPr>
-              <w:br/>
-            </w:r>
-            <w:r>
-              <w:rPr>
-                <w:sz w:val="16"/>
-              </w:rPr>
-              <w:br/>
+              <w:rPr>
+                <w:sz w:val="16"/>
+              </w:rPr>
+            </w:pPr>
+            <w:r>
+              <w:rPr>
+                <w:sz w:val="16"/>
+              </w:rPr>
+              <w:br/>
+            </w:r>
+            <w:r>
+              <w:rPr>
+                <w:sz w:val="16"/>
+              </w:rPr>
+              <w:t>{</w:t>
+            </w:r>
+          </w:p>
+          <w:p>
+            <w:pPr>
+              <w:spacing w:after="20"/>
+              <w:rPr>
+                <w:sz w:val="16"/>
+              </w:rPr>
+            </w:pPr>
+            <w:r>
+              <w:rPr>
+                <w:sz w:val="16"/>
+              </w:rPr>
+              <w:t xml:space="preserve">  "type": "CHAT",</w:t>
+            </w:r>
+          </w:p>
+          <w:p>
+            <w:pPr>
+              <w:spacing w:after="20"/>
+              <w:rPr>
+                <w:sz w:val="16"/>
+              </w:rPr>
+            </w:pPr>
+            <w:r>
+              <w:rPr>
+                <w:sz w:val="16"/>
+              </w:rPr>
+              <w:t xml:space="preserve">  "</w:t>
+            </w:r>
+            <w:proofErr w:type="spellStart"/>
+            <w:r>
+              <w:rPr>
+                <w:sz w:val="16"/>
+              </w:rPr>
+              <w:t>date_to</w:t>
+            </w:r>
+            <w:proofErr w:type="spellEnd"/>
+            <w:r>
+              <w:rPr>
+                <w:sz w:val="16"/>
+              </w:rPr>
+              <w:t>": null,</w:t>
+            </w:r>
+          </w:p>
+          <w:p>
+            <w:pPr>
+              <w:spacing w:after="20"/>
+              <w:rPr>
+                <w:sz w:val="16"/>
+              </w:rPr>
+            </w:pPr>
+            <w:r>
+              <w:rPr>
+                <w:sz w:val="16"/>
+              </w:rPr>
+              <w:t xml:space="preserve">  "urgency": "NORMAL",</w:t>
+            </w:r>
+          </w:p>
+          <w:p>
+            <w:pPr>
+              <w:spacing w:after="20"/>
+              <w:rPr>
+                <w:sz w:val="16"/>
+              </w:rPr>
+            </w:pPr>
+            <w:r>
+              <w:rPr>
+                <w:sz w:val="16"/>
+              </w:rPr>
+              <w:t xml:space="preserve">  "hashtags": [],</w:t>
+            </w:r>
+          </w:p>
+          <w:p>
+            <w:pPr>
+              <w:spacing w:after="20"/>
+              <w:rPr>
+                <w:sz w:val="16"/>
+              </w:rPr>
+            </w:pPr>
+            <w:r>
+              <w:rPr>
+                <w:sz w:val="16"/>
+              </w:rPr>
+              <w:t xml:space="preserve">  "</w:t>
+            </w:r>
+            <w:proofErr w:type="spellStart"/>
+            <w:r>
+              <w:rPr>
+                <w:sz w:val="16"/>
+              </w:rPr>
+              <w:t>date_from</w:t>
+            </w:r>
+            <w:proofErr w:type="spellEnd"/>
+            <w:r>
+              <w:rPr>
+                <w:sz w:val="16"/>
+              </w:rPr>
+              <w:t>": null,</w:t>
+            </w:r>
+          </w:p>
+          <w:p>
+            <w:pPr>
+              <w:spacing w:after="20"/>
+              <w:rPr>
+                <w:sz w:val="16"/>
+              </w:rPr>
+            </w:pPr>
+            <w:r>
+              <w:rPr>
+                <w:sz w:val="16"/>
+              </w:rPr>
+              <w:t xml:space="preserve">  "</w:t>
+            </w:r>
+            <w:proofErr w:type="spellStart"/>
+            <w:r>
+              <w:rPr>
+                <w:sz w:val="16"/>
+              </w:rPr>
+              <w:t>tool_hint</w:t>
+            </w:r>
+            <w:proofErr w:type="spellEnd"/>
+            <w:r>
+              <w:rPr>
+                <w:sz w:val="16"/>
+              </w:rPr>
+              <w:t>": "none",</w:t>
+            </w:r>
+          </w:p>
+          <w:p>
+            <w:pPr>
+              <w:spacing w:after="20"/>
+              <w:rPr>
+                <w:sz w:val="16"/>
+              </w:rPr>
+            </w:pPr>
+            <w:r>
+              <w:rPr>
+                <w:sz w:val="16"/>
+              </w:rPr>
+              <w:t xml:space="preserve">  "complexity": "GENERAL",</w:t>
+            </w:r>
+          </w:p>
+          <w:p>
+            <w:pPr>
+              <w:spacing w:after="20"/>
+              <w:rPr>
+                <w:sz w:val="16"/>
+              </w:rPr>
+            </w:pPr>
+            <w:r>
+              <w:rPr>
+                <w:sz w:val="16"/>
+              </w:rPr>
+              <w:t xml:space="preserve">  "professional": false,</w:t>
+            </w:r>
+          </w:p>
+          <w:p>
+            <w:pPr>
+              <w:spacing w:after="20"/>
+              <w:rPr>
+                <w:sz w:val="16"/>
+              </w:rPr>
+            </w:pPr>
+            <w:r>
+              <w:rPr>
+                <w:sz w:val="16"/>
+              </w:rPr>
+              <w:t xml:space="preserve">  "investigation": false,</w:t>
+            </w:r>
+          </w:p>
+          <w:p>
+            <w:pPr>
+              <w:spacing w:after="20"/>
+              <w:rPr>
+                <w:sz w:val="16"/>
+              </w:rPr>
+            </w:pPr>
+            <w:r>
+              <w:rPr>
+                <w:sz w:val="16"/>
+              </w:rPr>
+              <w:t xml:space="preserve">  "</w:t>
+            </w:r>
+            <w:proofErr w:type="spellStart"/>
+            <w:r>
+              <w:rPr>
+                <w:sz w:val="16"/>
+              </w:rPr>
+              <w:t>knowledge_tags</w:t>
+            </w:r>
+            <w:proofErr w:type="spellEnd"/>
+            <w:r>
+              <w:rPr>
+                <w:sz w:val="16"/>
+              </w:rPr>
+              <w:t>": [],</w:t>
+            </w:r>
+          </w:p>
+          <w:p>
+            <w:pPr>
+              <w:spacing w:after="20"/>
+              <w:rPr>
+                <w:sz w:val="16"/>
+              </w:rPr>
+            </w:pPr>
+            <w:r>
+              <w:rPr>
+                <w:sz w:val="16"/>
+              </w:rPr>
+              <w:t xml:space="preserve">  "</w:t>
+            </w:r>
+            <w:proofErr w:type="spellStart"/>
+            <w:r>
+              <w:rPr>
+                <w:sz w:val="16"/>
+              </w:rPr>
+              <w:t>professional_reason</w:t>
+            </w:r>
+            <w:proofErr w:type="spellEnd"/>
+            <w:r>
+              <w:rPr>
+                <w:sz w:val="16"/>
+              </w:rPr>
+              <w:t>": "",</w:t>
+            </w:r>
+          </w:p>
+          <w:p>
+            <w:pPr>
+              <w:spacing w:after="20"/>
+              <w:rPr>
+                <w:sz w:val="16"/>
+              </w:rPr>
+            </w:pPr>
+            <w:r>
+              <w:rPr>
+                <w:sz w:val="16"/>
+              </w:rPr>
+              <w:t xml:space="preserve">  "</w:t>
+            </w:r>
+            <w:proofErr w:type="spellStart"/>
+            <w:r>
+              <w:rPr>
+                <w:sz w:val="16"/>
+              </w:rPr>
+              <w:t>investigation_reason</w:t>
+            </w:r>
+            <w:proofErr w:type="spellEnd"/>
+            <w:r>
+              <w:rPr>
+                <w:sz w:val="16"/>
+              </w:rPr>
+              <w:t>": "",</w:t>
+            </w:r>
+          </w:p>
+          <w:p>
+            <w:pPr>
+              <w:spacing w:after="20"/>
+              <w:rPr>
+                <w:sz w:val="16"/>
+              </w:rPr>
+            </w:pPr>
+            <w:r>
+              <w:rPr>
+                <w:sz w:val="16"/>
+              </w:rPr>
+              <w:t xml:space="preserve">  "</w:t>
+            </w:r>
+            <w:proofErr w:type="spellStart"/>
+            <w:r>
+              <w:rPr>
+                <w:sz w:val="16"/>
+              </w:rPr>
+              <w:t>knowledge_vocabulary_match</w:t>
+            </w:r>
+            <w:proofErr w:type="spellEnd"/>
+            <w:r>
+              <w:rPr>
+                <w:sz w:val="16"/>
+              </w:rPr>
+              <w:t>": null,</w:t>
+            </w:r>
+          </w:p>
+          <w:p>
+            <w:pPr>
+              <w:spacing w:after="20"/>
+              <w:rPr>
+                <w:sz w:val="16"/>
+              </w:rPr>
+            </w:pPr>
+            <w:r>
+              <w:rPr>
+                <w:sz w:val="16"/>
+              </w:rPr>
+              <w:t xml:space="preserve">  "</w:t>
+            </w:r>
+            <w:proofErr w:type="spellStart"/>
+            <w:r>
+              <w:rPr>
+                <w:sz w:val="16"/>
+              </w:rPr>
+              <w:t>knowledge_vocabulary_checked</w:t>
+            </w:r>
+            <w:proofErr w:type="spellEnd"/>
+            <w:r>
+              <w:rPr>
+                <w:sz w:val="16"/>
+              </w:rPr>
+              <w:t>": true</w:t>
+            </w:r>
+          </w:p>
+          <w:p>
+            <w:pPr>
+              <w:spacing w:after="20"/>
+            </w:pPr>
+            <w:r>
+              <w:rPr>
+                <w:sz w:val="16"/>
+              </w:rPr>
+              <w:t>}</w:t>
             </w:r>
             <w:r>
               <w:rPr>
@@ -1613,6 +1927,7 @@
             <w:r>
               <w:rPr>
                 <w:sz w:val="16"/>
+                <w:highlight w:val="green"/>
               </w:rPr>
               <w:t>Pass [ ]</w:t>
             </w:r>
@@ -1770,31 +2085,344 @@
           <w:p>
             <w:pPr>
               <w:spacing w:after="20"/>
-            </w:pPr>
-            <w:r>
-              <w:rPr>
-                <w:sz w:val="16"/>
-              </w:rPr>
-              <w:br/>
-            </w:r>
-            <w:r>
-              <w:rPr>
-                <w:sz w:val="16"/>
-              </w:rPr>
-              <w:br/>
-            </w:r>
-            <w:r>
-              <w:rPr>
-                <w:sz w:val="16"/>
-              </w:rPr>
-              <w:br/>
-            </w:r>
-            <w:r>
-              <w:rPr>
-                <w:sz w:val="16"/>
-              </w:rPr>
-              <w:br/>
-            </w:r>
+              <w:rPr>
+                <w:sz w:val="16"/>
+              </w:rPr>
+            </w:pPr>
+            <w:r>
+              <w:rPr>
+                <w:sz w:val="16"/>
+              </w:rPr>
+              <w:t>{</w:t>
+            </w:r>
+          </w:p>
+          <w:p>
+            <w:pPr>
+              <w:spacing w:after="20"/>
+              <w:rPr>
+                <w:sz w:val="16"/>
+              </w:rPr>
+            </w:pPr>
+            <w:r>
+              <w:rPr>
+                <w:sz w:val="16"/>
+              </w:rPr>
+              <w:t xml:space="preserve">  "type": "CHAT",</w:t>
+            </w:r>
+          </w:p>
+          <w:p>
+            <w:pPr>
+              <w:spacing w:after="20"/>
+              <w:rPr>
+                <w:sz w:val="16"/>
+              </w:rPr>
+            </w:pPr>
+            <w:r>
+              <w:rPr>
+                <w:sz w:val="16"/>
+              </w:rPr>
+              <w:t xml:space="preserve">  "</w:t>
+            </w:r>
+            <w:proofErr w:type="spellStart"/>
+            <w:r>
+              <w:rPr>
+                <w:sz w:val="16"/>
+              </w:rPr>
+              <w:t>date_to</w:t>
+            </w:r>
+            <w:proofErr w:type="spellEnd"/>
+            <w:r>
+              <w:rPr>
+                <w:sz w:val="16"/>
+              </w:rPr>
+              <w:t>": null,</w:t>
+            </w:r>
+          </w:p>
+          <w:p>
+            <w:pPr>
+              <w:spacing w:after="20"/>
+              <w:rPr>
+                <w:sz w:val="16"/>
+              </w:rPr>
+            </w:pPr>
+            <w:r>
+              <w:rPr>
+                <w:sz w:val="16"/>
+              </w:rPr>
+              <w:t xml:space="preserve">  "urgency": "NORMAL",</w:t>
+            </w:r>
+          </w:p>
+          <w:p>
+            <w:pPr>
+              <w:spacing w:after="20"/>
+              <w:rPr>
+                <w:sz w:val="16"/>
+              </w:rPr>
+            </w:pPr>
+            <w:r>
+              <w:rPr>
+                <w:sz w:val="16"/>
+              </w:rPr>
+              <w:t xml:space="preserve">  "hashtags": [],</w:t>
+            </w:r>
+          </w:p>
+          <w:p>
+            <w:pPr>
+              <w:spacing w:after="20"/>
+              <w:rPr>
+                <w:sz w:val="16"/>
+              </w:rPr>
+            </w:pPr>
+            <w:r>
+              <w:rPr>
+                <w:sz w:val="16"/>
+              </w:rPr>
+              <w:t xml:space="preserve">  "</w:t>
+            </w:r>
+            <w:proofErr w:type="spellStart"/>
+            <w:r>
+              <w:rPr>
+                <w:sz w:val="16"/>
+              </w:rPr>
+              <w:t>date_from</w:t>
+            </w:r>
+            <w:proofErr w:type="spellEnd"/>
+            <w:r>
+              <w:rPr>
+                <w:sz w:val="16"/>
+              </w:rPr>
+              <w:t>": null,</w:t>
+            </w:r>
+          </w:p>
+          <w:p>
+            <w:pPr>
+              <w:spacing w:after="20"/>
+              <w:rPr>
+                <w:sz w:val="16"/>
+              </w:rPr>
+            </w:pPr>
+            <w:r>
+              <w:rPr>
+                <w:sz w:val="16"/>
+              </w:rPr>
+              <w:t xml:space="preserve">  "</w:t>
+            </w:r>
+            <w:proofErr w:type="spellStart"/>
+            <w:r>
+              <w:rPr>
+                <w:sz w:val="16"/>
+              </w:rPr>
+              <w:t>tool_hint</w:t>
+            </w:r>
+            <w:proofErr w:type="spellEnd"/>
+            <w:r>
+              <w:rPr>
+                <w:sz w:val="16"/>
+              </w:rPr>
+              <w:t>": "none",</w:t>
+            </w:r>
+          </w:p>
+          <w:p>
+            <w:pPr>
+              <w:spacing w:after="20"/>
+              <w:rPr>
+                <w:sz w:val="16"/>
+              </w:rPr>
+            </w:pPr>
+            <w:r>
+              <w:rPr>
+                <w:sz w:val="16"/>
+              </w:rPr>
+              <w:t xml:space="preserve">  "complexity": "GENERAL",</w:t>
+            </w:r>
+          </w:p>
+          <w:p>
+            <w:pPr>
+              <w:spacing w:after="20"/>
+              <w:rPr>
+                <w:sz w:val="16"/>
+              </w:rPr>
+            </w:pPr>
+            <w:r>
+              <w:rPr>
+                <w:sz w:val="16"/>
+              </w:rPr>
+              <w:t xml:space="preserve">  "professional": false,</w:t>
+            </w:r>
+          </w:p>
+          <w:p>
+            <w:pPr>
+              <w:spacing w:after="20"/>
+              <w:rPr>
+                <w:sz w:val="16"/>
+              </w:rPr>
+            </w:pPr>
+            <w:r>
+              <w:rPr>
+                <w:sz w:val="16"/>
+              </w:rPr>
+              <w:t xml:space="preserve">  "investigation": false,</w:t>
+            </w:r>
+          </w:p>
+          <w:p>
+            <w:pPr>
+              <w:spacing w:after="20"/>
+              <w:rPr>
+                <w:sz w:val="16"/>
+              </w:rPr>
+            </w:pPr>
+            <w:r>
+              <w:rPr>
+                <w:sz w:val="16"/>
+              </w:rPr>
+              <w:t xml:space="preserve">  "</w:t>
+            </w:r>
+            <w:proofErr w:type="spellStart"/>
+            <w:r>
+              <w:rPr>
+                <w:sz w:val="16"/>
+              </w:rPr>
+              <w:t>knowledge_tags</w:t>
+            </w:r>
+            <w:proofErr w:type="spellEnd"/>
+            <w:r>
+              <w:rPr>
+                <w:sz w:val="16"/>
+              </w:rPr>
+              <w:t>": [],</w:t>
+            </w:r>
+          </w:p>
+          <w:p>
+            <w:pPr>
+              <w:spacing w:after="20"/>
+              <w:rPr>
+                <w:sz w:val="16"/>
+              </w:rPr>
+            </w:pPr>
+            <w:r>
+              <w:rPr>
+                <w:sz w:val="16"/>
+              </w:rPr>
+              <w:lastRenderedPageBreak/>
+              <w:t xml:space="preserve">  "</w:t>
+            </w:r>
+            <w:proofErr w:type="spellStart"/>
+            <w:r>
+              <w:rPr>
+                <w:sz w:val="16"/>
+              </w:rPr>
+              <w:t>professional_reason</w:t>
+            </w:r>
+            <w:proofErr w:type="spellEnd"/>
+            <w:r>
+              <w:rPr>
+                <w:sz w:val="16"/>
+              </w:rPr>
+              <w:t>": "",</w:t>
+            </w:r>
+          </w:p>
+          <w:p>
+            <w:pPr>
+              <w:spacing w:after="20"/>
+              <w:rPr>
+                <w:sz w:val="16"/>
+              </w:rPr>
+            </w:pPr>
+            <w:r>
+              <w:rPr>
+                <w:sz w:val="16"/>
+              </w:rPr>
+              <w:t xml:space="preserve">  "</w:t>
+            </w:r>
+            <w:proofErr w:type="spellStart"/>
+            <w:r>
+              <w:rPr>
+                <w:sz w:val="16"/>
+              </w:rPr>
+              <w:t>investigation_reason</w:t>
+            </w:r>
+            <w:proofErr w:type="spellEnd"/>
+            <w:r>
+              <w:rPr>
+                <w:sz w:val="16"/>
+              </w:rPr>
+              <w:t>": "",</w:t>
+            </w:r>
+          </w:p>
+          <w:p>
+            <w:pPr>
+              <w:spacing w:after="20"/>
+              <w:rPr>
+                <w:sz w:val="16"/>
+              </w:rPr>
+            </w:pPr>
+            <w:r>
+              <w:rPr>
+                <w:sz w:val="16"/>
+              </w:rPr>
+              <w:t xml:space="preserve">  "</w:t>
+            </w:r>
+            <w:proofErr w:type="spellStart"/>
+            <w:r>
+              <w:rPr>
+                <w:sz w:val="16"/>
+              </w:rPr>
+              <w:t>knowledge_vocabulary_match</w:t>
+            </w:r>
+            <w:proofErr w:type="spellEnd"/>
+            <w:r>
+              <w:rPr>
+                <w:sz w:val="16"/>
+              </w:rPr>
+              <w:t>": null,</w:t>
+            </w:r>
+          </w:p>
+          <w:p>
+            <w:pPr>
+              <w:spacing w:after="20"/>
+              <w:rPr>
+                <w:sz w:val="16"/>
+              </w:rPr>
+            </w:pPr>
+            <w:r>
+              <w:rPr>
+                <w:sz w:val="16"/>
+              </w:rPr>
+              <w:t xml:space="preserve">  "</w:t>
+            </w:r>
+            <w:proofErr w:type="spellStart"/>
+            <w:r>
+              <w:rPr>
+                <w:sz w:val="16"/>
+              </w:rPr>
+              <w:t>knowledge_vocabulary_checked</w:t>
+            </w:r>
+            <w:proofErr w:type="spellEnd"/>
+            <w:r>
+              <w:rPr>
+                <w:sz w:val="16"/>
+              </w:rPr>
+              <w:t>": true</w:t>
+            </w:r>
+          </w:p>
+          <w:p>
+            <w:pPr>
+              <w:spacing w:after="20"/>
+              <w:rPr>
+                <w:sz w:val="16"/>
+              </w:rPr>
+            </w:pPr>
+            <w:r>
+              <w:rPr>
+                <w:sz w:val="16"/>
+              </w:rPr>
+              <w:t>}</w:t>
+            </w:r>
+          </w:p>
+          <w:p>
+            <w:pPr>
+              <w:spacing w:after="20"/>
+            </w:pPr>
           </w:p>
         </w:tc>
         <w:tc>
@@ -1817,7 +2445,9 @@
             <w:r>
               <w:rPr>
                 <w:sz w:val="16"/>
-              </w:rPr>
+                <w:highlight w:val="green"/>
+              </w:rPr>
+              <w:lastRenderedPageBreak/>
               <w:t>Pass [ ]</w:t>
             </w:r>
             <w:r>
@@ -1974,31 +2604,349 @@
           <w:p>
             <w:pPr>
               <w:spacing w:after="20"/>
-            </w:pPr>
-            <w:r>
-              <w:rPr>
-                <w:sz w:val="16"/>
-              </w:rPr>
-              <w:br/>
-            </w:r>
-            <w:r>
-              <w:rPr>
-                <w:sz w:val="16"/>
-              </w:rPr>
-              <w:br/>
-            </w:r>
-            <w:r>
-              <w:rPr>
-                <w:sz w:val="16"/>
-              </w:rPr>
-              <w:br/>
-            </w:r>
-            <w:r>
-              <w:rPr>
-                <w:sz w:val="16"/>
-              </w:rPr>
-              <w:br/>
-            </w:r>
+              <w:rPr>
+                <w:sz w:val="16"/>
+              </w:rPr>
+            </w:pPr>
+            <w:r>
+              <w:rPr>
+                <w:sz w:val="16"/>
+              </w:rPr>
+              <w:br/>
+            </w:r>
+            <w:r>
+              <w:rPr>
+                <w:sz w:val="16"/>
+              </w:rPr>
+              <w:t>{</w:t>
+            </w:r>
+          </w:p>
+          <w:p>
+            <w:pPr>
+              <w:spacing w:after="20"/>
+              <w:rPr>
+                <w:sz w:val="16"/>
+              </w:rPr>
+            </w:pPr>
+            <w:r>
+              <w:rPr>
+                <w:sz w:val="16"/>
+              </w:rPr>
+              <w:t xml:space="preserve">  "type": "CHAT",</w:t>
+            </w:r>
+          </w:p>
+          <w:p>
+            <w:pPr>
+              <w:spacing w:after="20"/>
+              <w:rPr>
+                <w:sz w:val="16"/>
+              </w:rPr>
+            </w:pPr>
+            <w:r>
+              <w:rPr>
+                <w:sz w:val="16"/>
+              </w:rPr>
+              <w:t xml:space="preserve">  "</w:t>
+            </w:r>
+            <w:proofErr w:type="spellStart"/>
+            <w:r>
+              <w:rPr>
+                <w:sz w:val="16"/>
+              </w:rPr>
+              <w:t>date_to</w:t>
+            </w:r>
+            <w:proofErr w:type="spellEnd"/>
+            <w:r>
+              <w:rPr>
+                <w:sz w:val="16"/>
+              </w:rPr>
+              <w:t>": null,</w:t>
+            </w:r>
+          </w:p>
+          <w:p>
+            <w:pPr>
+              <w:spacing w:after="20"/>
+              <w:rPr>
+                <w:sz w:val="16"/>
+              </w:rPr>
+            </w:pPr>
+            <w:r>
+              <w:rPr>
+                <w:sz w:val="16"/>
+              </w:rPr>
+              <w:t xml:space="preserve">  "urgency": "NORMAL",</w:t>
+            </w:r>
+          </w:p>
+          <w:p>
+            <w:pPr>
+              <w:spacing w:after="20"/>
+              <w:rPr>
+                <w:sz w:val="16"/>
+              </w:rPr>
+            </w:pPr>
+            <w:r>
+              <w:rPr>
+                <w:sz w:val="16"/>
+              </w:rPr>
+              <w:t xml:space="preserve">  "hashtags": [],</w:t>
+            </w:r>
+          </w:p>
+          <w:p>
+            <w:pPr>
+              <w:spacing w:after="20"/>
+              <w:rPr>
+                <w:sz w:val="16"/>
+              </w:rPr>
+            </w:pPr>
+            <w:r>
+              <w:rPr>
+                <w:sz w:val="16"/>
+              </w:rPr>
+              <w:t xml:space="preserve">  "</w:t>
+            </w:r>
+            <w:proofErr w:type="spellStart"/>
+            <w:r>
+              <w:rPr>
+                <w:sz w:val="16"/>
+              </w:rPr>
+              <w:t>date_from</w:t>
+            </w:r>
+            <w:proofErr w:type="spellEnd"/>
+            <w:r>
+              <w:rPr>
+                <w:sz w:val="16"/>
+              </w:rPr>
+              <w:t>": null,</w:t>
+            </w:r>
+          </w:p>
+          <w:p>
+            <w:pPr>
+              <w:spacing w:after="20"/>
+              <w:rPr>
+                <w:sz w:val="16"/>
+              </w:rPr>
+            </w:pPr>
+            <w:r>
+              <w:rPr>
+                <w:sz w:val="16"/>
+              </w:rPr>
+              <w:t xml:space="preserve">  "</w:t>
+            </w:r>
+            <w:proofErr w:type="spellStart"/>
+            <w:r>
+              <w:rPr>
+                <w:sz w:val="16"/>
+              </w:rPr>
+              <w:t>tool_hint</w:t>
+            </w:r>
+            <w:proofErr w:type="spellEnd"/>
+            <w:r>
+              <w:rPr>
+                <w:sz w:val="16"/>
+              </w:rPr>
+              <w:t>": "none",</w:t>
+            </w:r>
+          </w:p>
+          <w:p>
+            <w:pPr>
+              <w:spacing w:after="20"/>
+              <w:rPr>
+                <w:sz w:val="16"/>
+              </w:rPr>
+            </w:pPr>
+            <w:r>
+              <w:rPr>
+                <w:sz w:val="16"/>
+              </w:rPr>
+              <w:t xml:space="preserve">  "complexity": "GENERAL",</w:t>
+            </w:r>
+          </w:p>
+          <w:p>
+            <w:pPr>
+              <w:spacing w:after="20"/>
+              <w:rPr>
+                <w:sz w:val="16"/>
+              </w:rPr>
+            </w:pPr>
+            <w:r>
+              <w:rPr>
+                <w:sz w:val="16"/>
+              </w:rPr>
+              <w:t xml:space="preserve">  "professional": false,</w:t>
+            </w:r>
+          </w:p>
+          <w:p>
+            <w:pPr>
+              <w:spacing w:after="20"/>
+              <w:rPr>
+                <w:sz w:val="16"/>
+              </w:rPr>
+            </w:pPr>
+            <w:r>
+              <w:rPr>
+                <w:sz w:val="16"/>
+              </w:rPr>
+              <w:t xml:space="preserve">  "investigation": false,</w:t>
+            </w:r>
+          </w:p>
+          <w:p>
+            <w:pPr>
+              <w:spacing w:after="20"/>
+              <w:rPr>
+                <w:sz w:val="16"/>
+              </w:rPr>
+            </w:pPr>
+            <w:r>
+              <w:rPr>
+                <w:sz w:val="16"/>
+              </w:rPr>
+              <w:t xml:space="preserve">  "</w:t>
+            </w:r>
+            <w:proofErr w:type="spellStart"/>
+            <w:r>
+              <w:rPr>
+                <w:sz w:val="16"/>
+              </w:rPr>
+              <w:t>knowledge_tags</w:t>
+            </w:r>
+            <w:proofErr w:type="spellEnd"/>
+            <w:r>
+              <w:rPr>
+                <w:sz w:val="16"/>
+              </w:rPr>
+              <w:t>": [],</w:t>
+            </w:r>
+          </w:p>
+          <w:p>
+            <w:pPr>
+              <w:spacing w:after="20"/>
+              <w:rPr>
+                <w:sz w:val="16"/>
+              </w:rPr>
+            </w:pPr>
+            <w:r>
+              <w:rPr>
+                <w:sz w:val="16"/>
+              </w:rPr>
+              <w:t xml:space="preserve">  "</w:t>
+            </w:r>
+            <w:proofErr w:type="spellStart"/>
+            <w:r>
+              <w:rPr>
+                <w:sz w:val="16"/>
+              </w:rPr>
+              <w:t>professional_reason</w:t>
+            </w:r>
+            <w:proofErr w:type="spellEnd"/>
+            <w:r>
+              <w:rPr>
+                <w:sz w:val="16"/>
+              </w:rPr>
+              <w:t>": "",</w:t>
+            </w:r>
+          </w:p>
+          <w:p>
+            <w:pPr>
+              <w:spacing w:after="20"/>
+              <w:rPr>
+                <w:sz w:val="16"/>
+              </w:rPr>
+            </w:pPr>
+            <w:r>
+              <w:rPr>
+                <w:sz w:val="16"/>
+              </w:rPr>
+              <w:t xml:space="preserve">  "</w:t>
+            </w:r>
+            <w:proofErr w:type="spellStart"/>
+            <w:r>
+              <w:rPr>
+                <w:sz w:val="16"/>
+              </w:rPr>
+              <w:t>investigation_reason</w:t>
+            </w:r>
+            <w:proofErr w:type="spellEnd"/>
+            <w:r>
+              <w:rPr>
+                <w:sz w:val="16"/>
+              </w:rPr>
+              <w:t>": "",</w:t>
+            </w:r>
+          </w:p>
+          <w:p>
+            <w:pPr>
+              <w:spacing w:after="20"/>
+              <w:rPr>
+                <w:sz w:val="16"/>
+              </w:rPr>
+            </w:pPr>
+            <w:r>
+              <w:rPr>
+                <w:sz w:val="16"/>
+              </w:rPr>
+              <w:t xml:space="preserve">  "</w:t>
+            </w:r>
+            <w:proofErr w:type="spellStart"/>
+            <w:r>
+              <w:rPr>
+                <w:sz w:val="16"/>
+              </w:rPr>
+              <w:t>knowledge_vocabulary_match</w:t>
+            </w:r>
+            <w:proofErr w:type="spellEnd"/>
+            <w:r>
+              <w:rPr>
+                <w:sz w:val="16"/>
+              </w:rPr>
+              <w:t>": null,</w:t>
+            </w:r>
+          </w:p>
+          <w:p>
+            <w:pPr>
+              <w:spacing w:after="20"/>
+              <w:rPr>
+                <w:sz w:val="16"/>
+              </w:rPr>
+            </w:pPr>
+            <w:r>
+              <w:rPr>
+                <w:sz w:val="16"/>
+              </w:rPr>
+              <w:t xml:space="preserve">  "</w:t>
+            </w:r>
+            <w:proofErr w:type="spellStart"/>
+            <w:r>
+              <w:rPr>
+                <w:sz w:val="16"/>
+              </w:rPr>
+              <w:t>knowledge_vocabulary_checked</w:t>
+            </w:r>
+            <w:proofErr w:type="spellEnd"/>
+            <w:r>
+              <w:rPr>
+                <w:sz w:val="16"/>
+              </w:rPr>
+              <w:t>": true</w:t>
+            </w:r>
+          </w:p>
+          <w:p>
+            <w:pPr>
+              <w:spacing w:after="20"/>
+              <w:rPr>
+                <w:sz w:val="16"/>
+              </w:rPr>
+            </w:pPr>
+            <w:r>
+              <w:rPr>
+                <w:sz w:val="16"/>
+              </w:rPr>
+              <w:t>}</w:t>
+            </w:r>
+          </w:p>
+          <w:p>
+            <w:pPr>
+              <w:spacing w:after="20"/>
+            </w:pPr>
           </w:p>
         </w:tc>
         <w:tc>
@@ -2178,30 +3126,337 @@
           <w:p>
             <w:pPr>
               <w:spacing w:after="20"/>
-            </w:pPr>
-            <w:r>
-              <w:rPr>
-                <w:sz w:val="16"/>
-              </w:rPr>
-              <w:br/>
-            </w:r>
-            <w:r>
-              <w:rPr>
-                <w:sz w:val="16"/>
-              </w:rPr>
-              <w:br/>
-            </w:r>
-            <w:r>
-              <w:rPr>
-                <w:sz w:val="16"/>
-              </w:rPr>
-              <w:br/>
-            </w:r>
-            <w:r>
-              <w:rPr>
-                <w:sz w:val="16"/>
-              </w:rPr>
-              <w:br/>
+              <w:rPr>
+                <w:sz w:val="16"/>
+              </w:rPr>
+            </w:pPr>
+            <w:r>
+              <w:rPr>
+                <w:sz w:val="16"/>
+              </w:rPr>
+              <w:t>{</w:t>
+            </w:r>
+          </w:p>
+          <w:p>
+            <w:pPr>
+              <w:spacing w:after="20"/>
+              <w:rPr>
+                <w:sz w:val="16"/>
+              </w:rPr>
+            </w:pPr>
+            <w:r>
+              <w:rPr>
+                <w:sz w:val="16"/>
+              </w:rPr>
+              <w:t xml:space="preserve">  "type": "CHAT",</w:t>
+            </w:r>
+          </w:p>
+          <w:p>
+            <w:pPr>
+              <w:spacing w:after="20"/>
+              <w:rPr>
+                <w:sz w:val="16"/>
+              </w:rPr>
+            </w:pPr>
+            <w:r>
+              <w:rPr>
+                <w:sz w:val="16"/>
+              </w:rPr>
+              <w:t xml:space="preserve">  "</w:t>
+            </w:r>
+            <w:proofErr w:type="spellStart"/>
+            <w:r>
+              <w:rPr>
+                <w:sz w:val="16"/>
+              </w:rPr>
+              <w:t>date_to</w:t>
+            </w:r>
+            <w:proofErr w:type="spellEnd"/>
+            <w:r>
+              <w:rPr>
+                <w:sz w:val="16"/>
+              </w:rPr>
+              <w:t>": null,</w:t>
+            </w:r>
+          </w:p>
+          <w:p>
+            <w:pPr>
+              <w:spacing w:after="20"/>
+              <w:rPr>
+                <w:sz w:val="16"/>
+              </w:rPr>
+            </w:pPr>
+            <w:r>
+              <w:rPr>
+                <w:sz w:val="16"/>
+              </w:rPr>
+              <w:t xml:space="preserve">  "urgency": "NORMAL",</w:t>
+            </w:r>
+          </w:p>
+          <w:p>
+            <w:pPr>
+              <w:spacing w:after="20"/>
+              <w:rPr>
+                <w:sz w:val="16"/>
+              </w:rPr>
+            </w:pPr>
+            <w:r>
+              <w:rPr>
+                <w:sz w:val="16"/>
+              </w:rPr>
+              <w:t xml:space="preserve">  "hashtags": [],</w:t>
+            </w:r>
+          </w:p>
+          <w:p>
+            <w:pPr>
+              <w:spacing w:after="20"/>
+              <w:rPr>
+                <w:sz w:val="16"/>
+              </w:rPr>
+            </w:pPr>
+            <w:r>
+              <w:rPr>
+                <w:sz w:val="16"/>
+              </w:rPr>
+              <w:t xml:space="preserve">  "</w:t>
+            </w:r>
+            <w:proofErr w:type="spellStart"/>
+            <w:r>
+              <w:rPr>
+                <w:sz w:val="16"/>
+              </w:rPr>
+              <w:t>date_from</w:t>
+            </w:r>
+            <w:proofErr w:type="spellEnd"/>
+            <w:r>
+              <w:rPr>
+                <w:sz w:val="16"/>
+              </w:rPr>
+              <w:t>": null,</w:t>
+            </w:r>
+          </w:p>
+          <w:p>
+            <w:pPr>
+              <w:spacing w:after="20"/>
+              <w:rPr>
+                <w:sz w:val="16"/>
+              </w:rPr>
+            </w:pPr>
+            <w:r>
+              <w:rPr>
+                <w:sz w:val="16"/>
+              </w:rPr>
+              <w:t xml:space="preserve">  "</w:t>
+            </w:r>
+            <w:proofErr w:type="spellStart"/>
+            <w:r>
+              <w:rPr>
+                <w:sz w:val="16"/>
+              </w:rPr>
+              <w:t>tool_hint</w:t>
+            </w:r>
+            <w:proofErr w:type="spellEnd"/>
+            <w:r>
+              <w:rPr>
+                <w:sz w:val="16"/>
+              </w:rPr>
+              <w:t>": "none",</w:t>
+            </w:r>
+          </w:p>
+          <w:p>
+            <w:pPr>
+              <w:spacing w:after="20"/>
+              <w:rPr>
+                <w:sz w:val="16"/>
+              </w:rPr>
+            </w:pPr>
+            <w:r>
+              <w:rPr>
+                <w:sz w:val="16"/>
+              </w:rPr>
+              <w:t xml:space="preserve">  "complexity": "GENERAL",</w:t>
+            </w:r>
+          </w:p>
+          <w:p>
+            <w:pPr>
+              <w:spacing w:after="20"/>
+              <w:rPr>
+                <w:sz w:val="16"/>
+              </w:rPr>
+            </w:pPr>
+            <w:r>
+              <w:rPr>
+                <w:sz w:val="16"/>
+              </w:rPr>
+              <w:t xml:space="preserve">  "professional": false,</w:t>
+            </w:r>
+          </w:p>
+          <w:p>
+            <w:pPr>
+              <w:spacing w:after="20"/>
+              <w:rPr>
+                <w:sz w:val="16"/>
+              </w:rPr>
+            </w:pPr>
+            <w:r>
+              <w:rPr>
+                <w:sz w:val="16"/>
+              </w:rPr>
+              <w:t xml:space="preserve">  "investigation": false,</w:t>
+            </w:r>
+          </w:p>
+          <w:p>
+            <w:pPr>
+              <w:spacing w:after="20"/>
+              <w:rPr>
+                <w:sz w:val="16"/>
+              </w:rPr>
+            </w:pPr>
+            <w:r>
+              <w:rPr>
+                <w:sz w:val="16"/>
+              </w:rPr>
+              <w:t xml:space="preserve">  "</w:t>
+            </w:r>
+            <w:proofErr w:type="spellStart"/>
+            <w:r>
+              <w:rPr>
+                <w:sz w:val="16"/>
+              </w:rPr>
+              <w:t>knowledge_tags</w:t>
+            </w:r>
+            <w:proofErr w:type="spellEnd"/>
+            <w:r>
+              <w:rPr>
+                <w:sz w:val="16"/>
+              </w:rPr>
+              <w:t>": [],</w:t>
+            </w:r>
+          </w:p>
+          <w:p>
+            <w:pPr>
+              <w:spacing w:after="20"/>
+              <w:rPr>
+                <w:sz w:val="16"/>
+              </w:rPr>
+            </w:pPr>
+            <w:r>
+              <w:rPr>
+                <w:sz w:val="16"/>
+              </w:rPr>
+              <w:t xml:space="preserve">  "</w:t>
+            </w:r>
+            <w:proofErr w:type="spellStart"/>
+            <w:r>
+              <w:rPr>
+                <w:sz w:val="16"/>
+              </w:rPr>
+              <w:t>professional_reason</w:t>
+            </w:r>
+            <w:proofErr w:type="spellEnd"/>
+            <w:r>
+              <w:rPr>
+                <w:sz w:val="16"/>
+              </w:rPr>
+              <w:t>": "",</w:t>
+            </w:r>
+          </w:p>
+          <w:p>
+            <w:pPr>
+              <w:spacing w:after="20"/>
+              <w:rPr>
+                <w:sz w:val="16"/>
+              </w:rPr>
+            </w:pPr>
+            <w:r>
+              <w:rPr>
+                <w:sz w:val="16"/>
+              </w:rPr>
+              <w:t xml:space="preserve">  "</w:t>
+            </w:r>
+            <w:proofErr w:type="spellStart"/>
+            <w:r>
+              <w:rPr>
+                <w:sz w:val="16"/>
+              </w:rPr>
+              <w:t>investigation_reason</w:t>
+            </w:r>
+            <w:proofErr w:type="spellEnd"/>
+            <w:r>
+              <w:rPr>
+                <w:sz w:val="16"/>
+              </w:rPr>
+              <w:t>": "",</w:t>
+            </w:r>
+          </w:p>
+          <w:p>
+            <w:pPr>
+              <w:spacing w:after="20"/>
+              <w:rPr>
+                <w:sz w:val="16"/>
+              </w:rPr>
+            </w:pPr>
+            <w:r>
+              <w:rPr>
+                <w:sz w:val="16"/>
+              </w:rPr>
+              <w:t xml:space="preserve">  "</w:t>
+            </w:r>
+            <w:proofErr w:type="spellStart"/>
+            <w:r>
+              <w:rPr>
+                <w:sz w:val="16"/>
+              </w:rPr>
+              <w:t>knowledge_vocabulary_match</w:t>
+            </w:r>
+            <w:proofErr w:type="spellEnd"/>
+            <w:r>
+              <w:rPr>
+                <w:sz w:val="16"/>
+              </w:rPr>
+              <w:t>": null,</w:t>
+            </w:r>
+          </w:p>
+          <w:p>
+            <w:pPr>
+              <w:spacing w:after="20"/>
+              <w:rPr>
+                <w:sz w:val="16"/>
+              </w:rPr>
+            </w:pPr>
+            <w:r>
+              <w:rPr>
+                <w:sz w:val="16"/>
+              </w:rPr>
+              <w:t xml:space="preserve">  "</w:t>
+            </w:r>
+            <w:proofErr w:type="spellStart"/>
+            <w:r>
+              <w:rPr>
+                <w:sz w:val="16"/>
+              </w:rPr>
+              <w:t>knowledge_vocabulary_checked</w:t>
+            </w:r>
+            <w:proofErr w:type="spellEnd"/>
+            <w:r>
+              <w:rPr>
+                <w:sz w:val="16"/>
+              </w:rPr>
+              <w:t>": true</w:t>
+            </w:r>
+          </w:p>
+          <w:p>
+            <w:pPr>
+              <w:spacing w:after="20"/>
+              <w:rPr>
+                <w:sz w:val="16"/>
+              </w:rPr>
+            </w:pPr>
+            <w:r>
+              <w:rPr>
+                <w:sz w:val="16"/>
+              </w:rPr>
+              <w:t>}</w:t>
             </w:r>
           </w:p>
         </w:tc>
@@ -2802,6 +4057,12 @@
               <w:rPr>
                 <w:sz w:val="16"/>
               </w:rPr>
+              <w:t>[classifier] type=RAG tool="alert" msg="What is the current project status?"</w:t>
+            </w:r>
+            <w:r>
+              <w:rPr>
+                <w:sz w:val="16"/>
+              </w:rPr>
               <w:br/>
             </w:r>
             <w:r>
@@ -3012,6 +4273,27 @@
               <w:rPr>
                 <w:sz w:val="16"/>
               </w:rPr>
+              <w:t>[classifier] type=RAG tool="alert" msg="</w:t>
+            </w:r>
+            <w:r>
+              <w:rPr>
+                <w:rFonts w:cs="Arial"/>
+                <w:sz w:val="16"/>
+                <w:rtl/>
+                <w:lang w:bidi="he-IL"/>
+              </w:rPr>
+              <w:t>מה קרה בפרויקט השבוע</w:t>
+            </w:r>
+            <w:r>
+              <w:rPr>
+                <w:sz w:val="16"/>
+              </w:rPr>
+              <w:t>?"</w:t>
+            </w:r>
+            <w:r>
+              <w:rPr>
+                <w:sz w:val="16"/>
+              </w:rPr>
               <w:br/>
             </w:r>
             <w:r>
@@ -3210,6 +4492,12 @@
               <w:rPr>
                 <w:sz w:val="16"/>
               </w:rPr>
+              <w:t>[classifier] type=RAG tool="emails" msg="Show the latest formal correspondence"</w:t>
+            </w:r>
+            <w:r>
+              <w:rPr>
+                <w:sz w:val="16"/>
+              </w:rPr>
               <w:br/>
             </w:r>
             <w:r>
@@ -3408,6 +4696,12 @@
               <w:rPr>
                 <w:sz w:val="16"/>
               </w:rPr>
+              <w:t>[classifier] type=RAG tool="meetings" msg="What was decided in the last meeting?"</w:t>
+            </w:r>
+            <w:r>
+              <w:rPr>
+                <w:sz w:val="16"/>
+              </w:rPr>
               <w:br/>
             </w:r>
             <w:r>
@@ -3608,6 +4902,40 @@
             <w:pPr>
               <w:spacing w:after="20"/>
             </w:pPr>
+            <w:r>
+              <w:rPr>
+                <w:sz w:val="16"/>
+              </w:rPr>
+              <w:t>[classifier] type=RAG tool="</w:t>
+            </w:r>
+            <w:proofErr w:type="spellStart"/>
+            <w:r>
+              <w:rPr>
+                <w:sz w:val="16"/>
+              </w:rPr>
+              <w:t>whatsapp_messages</w:t>
+            </w:r>
+            <w:proofErr w:type="spellEnd"/>
+            <w:r>
+              <w:rPr>
+                <w:sz w:val="16"/>
+              </w:rPr>
+              <w:t xml:space="preserve">" msg="show me recent site </w:t>
+            </w:r>
+            <w:proofErr w:type="spellStart"/>
+            <w:r>
+              <w:rPr>
+                <w:sz w:val="16"/>
+              </w:rPr>
+              <w:t>whatsapp</w:t>
+            </w:r>
+            <w:proofErr w:type="spellEnd"/>
+            <w:r>
+              <w:rPr>
+                <w:sz w:val="16"/>
+              </w:rPr>
+              <w:t xml:space="preserve"> updates"</w:t>
+            </w:r>
             <w:r>
               <w:rPr>
                 <w:sz w:val="16"/>
@@ -4027,6 +5355,26 @@
               <w:rPr>
                 <w:sz w:val="16"/>
               </w:rPr>
+              <w:t>[classifier] type=RAG tool="</w:t>
+            </w:r>
+            <w:proofErr w:type="spellStart"/>
+            <w:r>
+              <w:rPr>
+                <w:sz w:val="16"/>
+              </w:rPr>
+              <w:t>financial_transactions</w:t>
+            </w:r>
+            <w:proofErr w:type="spellEnd"/>
+            <w:r>
+              <w:rPr>
+                <w:sz w:val="16"/>
+              </w:rPr>
+              <w:t>" msg="Was invoice 1042 paid?"</w:t>
+            </w:r>
+            <w:r>
+              <w:rPr>
+                <w:sz w:val="16"/>
+              </w:rPr>
               <w:br/>
             </w:r>
             <w:r>
@@ -4232,6 +5580,26 @@
                 <w:sz w:val="16"/>
               </w:rPr>
               <w:br/>
+            </w:r>
+            <w:r>
+              <w:rPr>
+                <w:sz w:val="16"/>
+              </w:rPr>
+              <w:t>[classifier] type=RAG tool="</w:t>
+            </w:r>
+            <w:proofErr w:type="spellStart"/>
+            <w:r>
+              <w:rPr>
+                <w:sz w:val="16"/>
+              </w:rPr>
+              <w:t>quality_control,alert</w:t>
+            </w:r>
+            <w:proofErr w:type="spellEnd"/>
+            <w:r>
+              <w:rPr>
+                <w:sz w:val="16"/>
+              </w:rPr>
+              <w:t>" msg="Show open quality defects"</w:t>
             </w:r>
             <w:r>
               <w:rPr>
@@ -5966,6 +7334,7 @@
       </w:tr>
       <w:tr>
         <w:trPr>
+          <w:trHeight w:val="1227"/>
           <w:jc w:val="center"/>
         </w:trPr>
         <w:tc>
@@ -6267,6 +7636,26 @@
                 <w:sz w:val="16"/>
               </w:rPr>
               <w:br/>
+            </w:r>
+            <w:r>
+              <w:rPr>
+                <w:sz w:val="16"/>
+              </w:rPr>
+              <w:t>[classifier] type=RAG tool="</w:t>
+            </w:r>
+            <w:proofErr w:type="spellStart"/>
+            <w:r>
+              <w:rPr>
+                <w:sz w:val="16"/>
+              </w:rPr>
+              <w:t>safety_report</w:t>
+            </w:r>
+            <w:proofErr w:type="spellEnd"/>
+            <w:r>
+              <w:rPr>
+                <w:sz w:val="16"/>
+              </w:rPr>
+              <w:t>" msg="Show last month's safety report"</w:t>
             </w:r>
             <w:r>
               <w:rPr>
@@ -7739,6 +9128,14 @@
               </w:rPr>
               <w:br/>
             </w:r>
+            <w:r>
+              <w:rPr>
+                <w:sz w:val="16"/>
+              </w:rPr>
+              <w:t>[classifier] type=RAG tool="alert" msg="What is the project status?"</w:t>
+            </w:r>
+            <w:bookmarkStart w:id="0" w:name="_GoBack"/>
+            <w:bookmarkEnd w:id="0"/>
             <w:r>
               <w:rPr>
                 <w:sz w:val="16"/>
@@ -20220,10 +21617,6 @@
     <w:lsdException w:name="Book Title" w:uiPriority="33" w:qFormat="1"/>
     <w:lsdException w:name="Bibliography" w:semiHidden="1" w:uiPriority="37" w:unhideWhenUsed="1"/>
     <w:lsdException w:name="TOC Heading" w:semiHidden="1" w:uiPriority="39" w:unhideWhenUsed="1" w:qFormat="1"/>
-    <w:lsdException w:name="Grid Table Light" w:semiHidden="1" w:unhideWhenUsed="1"/>
-    <w:lsdException w:name="Grid Table 1 Light" w:semiHidden="1" w:unhideWhenUsed="1"/>
-    <w:lsdException w:name="Grid Table 2" w:semiHidden="1" w:unhideWhenUsed="1"/>
-    <w:lsdException w:name="Grid Table 3" w:semiHidden="1" w:unhideWhenUsed="1"/>
     <w:lsdException w:name="Grid Table 4" w:uiPriority="49"/>
     <w:lsdException w:name="Grid Table 5 Dark" w:uiPriority="50"/>
     <w:lsdException w:name="Grid Table 6 Colorful" w:uiPriority="51"/>
@@ -31321,6 +32714,37 @@
       </w:tcPr>
     </w:tblStylePr>
   </w:style>
+  <w:style w:type="paragraph" w:styleId="HTMLPreformatted">
+    <w:name w:val="HTML Preformatted"/>
+    <w:basedOn w:val="Normal"/>
+    <w:link w:val="HTMLPreformattedChar"/>
+    <w:uiPriority w:val="99"/>
+    <w:semiHidden/>
+    <w:unhideWhenUsed/>
+    <w:rsid w:val="00FC7843"/>
+    <w:pPr>
+      <w:spacing w:after="0" w:line="240" w:lineRule="auto"/>
+    </w:pPr>
+    <w:rPr>
+      <w:rFonts w:ascii="Consolas" w:hAnsi="Consolas"/>
+      <w:sz w:val="20"/>
+      <w:szCs w:val="20"/>
+    </w:rPr>
+  </w:style>
+  <w:style w:type="character" w:customStyle="1" w:styleId="HTMLPreformattedChar">
+    <w:name w:val="HTML Preformatted Char"/>
+    <w:basedOn w:val="DefaultParagraphFont"/>
+    <w:link w:val="HTMLPreformatted"/>
+    <w:uiPriority w:val="99"/>
+    <w:semiHidden/>
+    <w:rsid w:val="00FC7843"/>
+    <w:rPr>
+      <w:rFonts w:ascii="Consolas" w:hAnsi="Consolas"/>
+      <w:color w:val="1F2937"/>
+      <w:sz w:val="20"/>
+      <w:szCs w:val="20"/>
+    </w:rPr>
+  </w:style>
 </w:styles>
 </file>
 
@@ -31649,7 +33073,7 @@
 </file>
 
 <file path=customXml/itemProps1.xml><?xml version="1.0" encoding="utf-8"?>
-<ds:datastoreItem xmlns:ds="http://schemas.openxmlformats.org/officeDocument/2006/customXml" ds:itemID="{6FFA9A14-C10B-4425-9D9E-E303BE57334E}">
+<ds:datastoreItem xmlns:ds="http://schemas.openxmlformats.org/officeDocument/2006/customXml" ds:itemID="{65023DD6-E9E7-4B9D-9336-624DBA51BB36}">
   <ds:schemaRefs>
     <ds:schemaRef ds:uri="http://schemas.openxmlformats.org/officeDocument/2006/bibliography"/>
   </ds:schemaRefs>

</xml_diff>